<commit_message>
Prepare SEIP v0.2 pilot package
</commit_message>
<xml_diff>
--- a/docs/SEIP_WHITEPAPER_FINAL.docx
+++ b/docs/SEIP_WHITEPAPER_FINAL.docx
@@ -458,7 +458,7 @@
         </w:numPr>
       </w:pPr>
       <w:r>
-        <w:t xml:space="preserve">Enable CI to distinguish declared breaking changes from undeclared breaking changes.</w:t>
+        <w:t xml:space="preserve">Enable CI to distinguish validly declared breaking changes from undeclared or weakly declared breaking changes.</w:t>
       </w:r>
     </w:p>
     <w:p>
@@ -640,13 +640,13 @@
       </w:r>
     </w:p>
     <w:bookmarkEnd w:id="23"/>
-    <w:bookmarkStart w:id="24" w:name="data-types-are-first-class"/>
+    <w:bookmarkStart w:id="24" w:name="compatibility-tightening-is-first-class"/>
     <w:p>
       <w:pPr>
         <w:pStyle w:val="Heading3"/>
       </w:pPr>
       <w:r>
-        <w:t xml:space="preserve">Data Types Are First-Class</w:t>
+        <w:t xml:space="preserve">Compatibility Tightening Is First-Class</w:t>
       </w:r>
     </w:p>
     <w:p>
@@ -654,7 +654,7 @@
         <w:pStyle w:val="FirstParagraph"/>
       </w:pPr>
       <w:r>
-        <w:t xml:space="preserve">Schema compatibility is often decided by type evolution. SEIP distinguishes lossy transitions from safer widening transitions. For example,</w:t>
+        <w:t xml:space="preserve">Schema compatibility is often decided by type evolution and constraint changes. SEIP distinguishes lossy transitions from safer widening transitions. For example,</w:t>
       </w:r>
       <w:r>
         <w:t xml:space="preserve"> </w:t>
@@ -669,6 +669,21 @@
         <w:t xml:space="preserve"> </w:t>
       </w:r>
       <w:r>
+        <w:t xml:space="preserve">or JSON Schema</w:t>
+      </w:r>
+      <w:r>
+        <w:t xml:space="preserve"> </w:t>
+      </w:r>
+      <w:r>
+        <w:rPr>
+          <w:rStyle w:val="VerbatimChar"/>
+        </w:rPr>
+        <w:t xml:space="preserve">number</w:t>
+      </w:r>
+      <w:r>
+        <w:t xml:space="preserve"> </w:t>
+      </w:r>
+      <w:r>
         <w:t xml:space="preserve">to</w:t>
       </w:r>
       <w:r>
@@ -714,7 +729,34 @@
         <w:t xml:space="preserve"> </w:t>
       </w:r>
       <w:r>
-        <w:t xml:space="preserve">can be reported as a retype without automatically making the change breaking.</w:t>
+        <w:t xml:space="preserve">can be reported as a retype without automatically making the change breaking. The reference CLI also flags generic compatibility tightening such as making an existing field required, changing nullable to non-nullable, narrowing enum values, or changing a field format. It accepts SEIP object/table fixtures and common JSON Schema object inputs, including local references,</w:t>
+      </w:r>
+      <w:r>
+        <w:t xml:space="preserve"> </w:t>
+      </w:r>
+      <w:r>
+        <w:rPr>
+          <w:rStyle w:val="VerbatimChar"/>
+        </w:rPr>
+        <w:t xml:space="preserve">$defs</w:t>
+      </w:r>
+      <w:r>
+        <w:t xml:space="preserve">, nested object paths, array item fields, and simple</w:t>
+      </w:r>
+      <w:r>
+        <w:t xml:space="preserve"> </w:t>
+      </w:r>
+      <w:r>
+        <w:rPr>
+          <w:rStyle w:val="VerbatimChar"/>
+        </w:rPr>
+        <w:t xml:space="preserve">allOf</w:t>
+      </w:r>
+      <w:r>
+        <w:t xml:space="preserve"> </w:t>
+      </w:r>
+      <w:r>
+        <w:t xml:space="preserve">composition.</w:t>
       </w:r>
     </w:p>
     <w:bookmarkEnd w:id="24"/>
@@ -768,7 +810,22 @@
         <w:t xml:space="preserve">EXTENSION_REQUESTED</w:t>
       </w:r>
       <w:r>
-        <w:t xml:space="preserve">.</w:t>
+        <w:t xml:space="preserve">. In the reference CLI,</w:t>
+      </w:r>
+      <w:r>
+        <w:t xml:space="preserve"> </w:t>
+      </w:r>
+      <w:r>
+        <w:rPr>
+          <w:rStyle w:val="VerbatimChar"/>
+        </w:rPr>
+        <w:t xml:space="preserve">validate-consumer</w:t>
+      </w:r>
+      <w:r>
+        <w:t xml:space="preserve"> </w:t>
+      </w:r>
+      <w:r>
+        <w:t xml:space="preserve">verifies the target exists and can run an explicit local validation command with declaration context supplied through environment variables.</w:t>
       </w:r>
     </w:p>
     <w:bookmarkEnd w:id="25"/>
@@ -1357,6 +1414,59 @@
     </w:p>
     <w:p>
       <w:pPr>
+        <w:pStyle w:val="BodyText"/>
+      </w:pPr>
+      <w:r>
+        <w:t xml:space="preserve">The reference implementation enforces a conservative lifecycle boundary: only declared consumers can respond, responses are accepted only while a declaration is in review, and a declaration reaches</w:t>
+      </w:r>
+      <w:r>
+        <w:t xml:space="preserve"> </w:t>
+      </w:r>
+      <w:r>
+        <w:rPr>
+          <w:rStyle w:val="VerbatimChar"/>
+        </w:rPr>
+        <w:t xml:space="preserve">ACCEPTED</w:t>
+      </w:r>
+      <w:r>
+        <w:t xml:space="preserve"> </w:t>
+      </w:r>
+      <w:r>
+        <w:t xml:space="preserve">only when all declared consumers have acknowledged.</w:t>
+      </w:r>
+      <w:r>
+        <w:t xml:space="preserve"> </w:t>
+      </w:r>
+      <w:r>
+        <w:rPr>
+          <w:rStyle w:val="VerbatimChar"/>
+        </w:rPr>
+        <w:t xml:space="preserve">OBJECTED</w:t>
+      </w:r>
+      <w:r>
+        <w:t xml:space="preserve"> </w:t>
+      </w:r>
+      <w:r>
+        <w:t xml:space="preserve">and</w:t>
+      </w:r>
+      <w:r>
+        <w:t xml:space="preserve"> </w:t>
+      </w:r>
+      <w:r>
+        <w:rPr>
+          <w:rStyle w:val="VerbatimChar"/>
+        </w:rPr>
+        <w:t xml:space="preserve">EXTENSION_REQUESTED</w:t>
+      </w:r>
+      <w:r>
+        <w:t xml:space="preserve"> </w:t>
+      </w:r>
+      <w:r>
+        <w:t xml:space="preserve">keep the declaration in review until the negotiation is resolved.</w:t>
+      </w:r>
+    </w:p>
+    <w:p>
+      <w:pPr>
         <w:pStyle w:val="CaptionedFigure"/>
       </w:pPr>
       <w:r>
@@ -2184,6 +2294,21 @@
       </w:r>
       <w:r>
         <w:rPr>
+          <w:rStyle w:val="DataTypeTok"/>
+        </w:rPr>
+        <w:t xml:space="preserve">\</w:t>
+      </w:r>
+      <w:r>
+        <w:br/>
+      </w:r>
+      <w:r>
+        <w:rPr>
+          <w:rStyle w:val="NormalTok"/>
+        </w:rPr>
+        <w:t xml:space="preserve">  </w:t>
+      </w:r>
+      <w:r>
+        <w:rPr>
           <w:rStyle w:val="AttributeTok"/>
         </w:rPr>
         <w:t xml:space="preserve">--against</w:t>
@@ -2192,13 +2317,46 @@
         <w:rPr>
           <w:rStyle w:val="NormalTok"/>
         </w:rPr>
-        <w:t xml:space="preserve"> ./src/queries/</w:t>
+        <w:t xml:space="preserve"> ./src/queries/ </w:t>
+      </w:r>
+      <w:r>
+        <w:rPr>
+          <w:rStyle w:val="DataTypeTok"/>
+        </w:rPr>
+        <w:t xml:space="preserve">\</w:t>
       </w:r>
       <w:r>
         <w:br/>
       </w:r>
       <w:r>
         <w:rPr>
+          <w:rStyle w:val="NormalTok"/>
+        </w:rPr>
+        <w:t xml:space="preserve">  </w:t>
+      </w:r>
+      <w:r>
+        <w:rPr>
+          <w:rStyle w:val="AttributeTok"/>
+        </w:rPr>
+        <w:t xml:space="preserve">--command</w:t>
+      </w:r>
+      <w:r>
+        <w:rPr>
+          <w:rStyle w:val="NormalTok"/>
+        </w:rPr>
+        <w:t xml:space="preserve"> </w:t>
+      </w:r>
+      <w:r>
+        <w:rPr>
+          <w:rStyle w:val="StringTok"/>
+        </w:rPr>
+        <w:t xml:space="preserve">"npm test -- --schema-change"</w:t>
+      </w:r>
+      <w:r>
+        <w:br/>
+      </w:r>
+      <w:r>
+        <w:rPr>
           <w:rStyle w:val="ExtensionTok"/>
         </w:rPr>
         <w:t xml:space="preserve">npx</w:t>
@@ -2338,6 +2496,21 @@
       </w:r>
       <w:r>
         <w:rPr>
+          <w:rStyle w:val="DataTypeTok"/>
+        </w:rPr>
+        <w:t xml:space="preserve">\</w:t>
+      </w:r>
+      <w:r>
+        <w:br/>
+      </w:r>
+      <w:r>
+        <w:rPr>
+          <w:rStyle w:val="NormalTok"/>
+        </w:rPr>
+        <w:t xml:space="preserve">  </w:t>
+      </w:r>
+      <w:r>
+        <w:rPr>
           <w:rStyle w:val="AttributeTok"/>
         </w:rPr>
         <w:t xml:space="preserve">--against</w:t>
@@ -2346,7 +2519,40 @@
         <w:rPr>
           <w:rStyle w:val="NormalTok"/>
         </w:rPr>
-        <w:t xml:space="preserve"> ./models/</w:t>
+        <w:t xml:space="preserve"> ./models/ </w:t>
+      </w:r>
+      <w:r>
+        <w:rPr>
+          <w:rStyle w:val="DataTypeTok"/>
+        </w:rPr>
+        <w:t xml:space="preserve">\</w:t>
+      </w:r>
+      <w:r>
+        <w:br/>
+      </w:r>
+      <w:r>
+        <w:rPr>
+          <w:rStyle w:val="NormalTok"/>
+        </w:rPr>
+        <w:t xml:space="preserve">  </w:t>
+      </w:r>
+      <w:r>
+        <w:rPr>
+          <w:rStyle w:val="AttributeTok"/>
+        </w:rPr>
+        <w:t xml:space="preserve">--command</w:t>
+      </w:r>
+      <w:r>
+        <w:rPr>
+          <w:rStyle w:val="NormalTok"/>
+        </w:rPr>
+        <w:t xml:space="preserve"> </w:t>
+      </w:r>
+      <w:r>
+        <w:rPr>
+          <w:rStyle w:val="StringTok"/>
+        </w:rPr>
+        <w:t xml:space="preserve">"npm test -- --fraud-model-contract"</w:t>
       </w:r>
       <w:r>
         <w:br/>
@@ -2673,6 +2879,14 @@
       </w:pPr>
       <w:r>
         <w:t xml:space="preserve">This immediately gives one important property: CI can fail undeclared breaking changes before merge.</w:t>
+      </w:r>
+    </w:p>
+    <w:p>
+      <w:pPr>
+        <w:pStyle w:val="BodyText"/>
+      </w:pPr>
+      <w:r>
+        <w:t xml:space="preserve">For a breaking change to count as declared, the matching declaration must itself be valid, marked as breaking, use a compatible declaration type, include required migration metadata, and not be withdrawn or rejected. This prevents a weak placeholder declaration from accidentally satisfying the CI gate.</w:t>
       </w:r>
     </w:p>
     <w:p>
@@ -2941,6 +3155,39 @@
         <w:rPr>
           <w:rStyle w:val="NormalTok"/>
         </w:rPr>
+        <w:t xml:space="preserve"> seip validate-consumer seip_retype_transaction_value </w:t>
+      </w:r>
+      <w:r>
+        <w:rPr>
+          <w:rStyle w:val="AttributeTok"/>
+        </w:rPr>
+        <w:t xml:space="preserve">--against</w:t>
+      </w:r>
+      <w:r>
+        <w:rPr>
+          <w:rStyle w:val="NormalTok"/>
+        </w:rPr>
+        <w:t xml:space="preserve"> ./src/queries </w:t>
+      </w:r>
+      <w:r>
+        <w:rPr>
+          <w:rStyle w:val="AttributeTok"/>
+        </w:rPr>
+        <w:t xml:space="preserve">--json</w:t>
+      </w:r>
+      <w:r>
+        <w:br/>
+      </w:r>
+      <w:r>
+        <w:rPr>
+          <w:rStyle w:val="ExtensionTok"/>
+        </w:rPr>
+        <w:t xml:space="preserve">npx</w:t>
+      </w:r>
+      <w:r>
+        <w:rPr>
+          <w:rStyle w:val="NormalTok"/>
+        </w:rPr>
         <w:t xml:space="preserve"> seip notify seip_retype_transaction_value </w:t>
       </w:r>
       <w:r>
@@ -3049,7 +3296,7 @@
         <w:pStyle w:val="FirstParagraph"/>
       </w:pPr>
       <w:r>
-        <w:t xml:space="preserve">Consumers still own their local migration work. One consumer may need a simple field rename. Another may need a backfill, reindex, parser change, or model retraining. SEIP gives those consumers a durable place to respond and gives CI a durable state to enforce.</w:t>
+        <w:t xml:space="preserve">Consumers still own their local migration work. One consumer may need a simple field rename. Another may need a backfill, reindex, parser change, or model retraining. SEIP gives those consumers a durable place to respond and gives CI a durable state to enforce. The consumer validation hook is deliberately command-based so teams can connect their existing parser tests, query checks, dbt builds, contract tests, or model rehearsals instead of waiting for SEIP to understand every downstream runtime.</w:t>
       </w:r>
     </w:p>
     <w:bookmarkEnd w:id="54"/>
@@ -3087,7 +3334,37 @@
         </w:numPr>
       </w:pPr>
       <w:r>
-        <w:t xml:space="preserve">Diffing is generic and not source-system-specific.</w:t>
+        <w:t xml:space="preserve">Diffing is generic and not source-system-specific, even though it now recognizes common compatibility tightening patterns and common JSON Schema object inputs. It is not a full JSON Schema dialect engine; remote references, full</w:t>
+      </w:r>
+      <w:r>
+        <w:t xml:space="preserve"> </w:t>
+      </w:r>
+      <w:r>
+        <w:rPr>
+          <w:rStyle w:val="VerbatimChar"/>
+        </w:rPr>
+        <w:t xml:space="preserve">oneOf</w:t>
+      </w:r>
+      <w:r>
+        <w:t xml:space="preserve"> </w:t>
+      </w:r>
+      <w:r>
+        <w:t xml:space="preserve">or</w:t>
+      </w:r>
+      <w:r>
+        <w:t xml:space="preserve"> </w:t>
+      </w:r>
+      <w:r>
+        <w:rPr>
+          <w:rStyle w:val="VerbatimChar"/>
+        </w:rPr>
+        <w:t xml:space="preserve">anyOf</w:t>
+      </w:r>
+      <w:r>
+        <w:t xml:space="preserve"> </w:t>
+      </w:r>
+      <w:r>
+        <w:t xml:space="preserve">semantics, Avro compatibility modes, dbt model lineage, and SQL DDL parsing remain adapter-specific.</w:t>
       </w:r>
     </w:p>
     <w:p>
@@ -3120,7 +3397,7 @@
         <w:t xml:space="preserve"> </w:t>
       </w:r>
       <w:r>
-        <w:t xml:space="preserve">is a reference hook rather than a universal contract testing engine.</w:t>
+        <w:t xml:space="preserve">verifies a target and can run a local command, but it remains a reference hook rather than a universal contract testing engine.</w:t>
       </w:r>
     </w:p>
     <w:p>
@@ -3190,7 +3467,7 @@
         <w:pStyle w:val="BodyText"/>
       </w:pPr>
       <w:r>
-        <w:t xml:space="preserve">Its immediate value is operational. CI can distinguish declared breaking changes from undeclared ones. Its broader value is organizational. Producer and consumer teams gain a shared artifact, a reviewable lifecycle, notification hooks for existing collaboration systems, and an audit trail that persists beyond transient coordination channels.</w:t>
+        <w:t xml:space="preserve">Its immediate value is operational. CI can distinguish validly declared breaking changes from undeclared or weakly declared ones. Its broader value is organizational. Producer and consumer teams gain a shared artifact, a reviewable lifecycle, notification hooks for existing collaboration systems, and an audit trail that persists beyond transient coordination channels.</w:t>
       </w:r>
     </w:p>
     <w:p>
@@ -3316,6 +3593,8 @@
     <w:bookmarkEnd w:id="57"/>
     <w:bookmarkEnd w:id="58"/>
     <w:sectPr>
+      <w:pgSz w:w="12240" w:h="15840"/>
+      <w:pgMar w:top="1440" w:right="1440" w:bottom="1440" w:left="1440" w:header="720" w:footer="720" w:gutter="0"/>
       <w:footnotePr>
         <w:numRestart w:val="eachSect"/>
       </w:footnotePr>

</xml_diff>

<commit_message>
Update whitepaper for pilot integration path
</commit_message>
<xml_diff>
--- a/docs/SEIP_WHITEPAPER_FINAL.docx
+++ b/docs/SEIP_WHITEPAPER_FINAL.docx
@@ -2,7 +2,7 @@
 <file path=word/document.xml><?xml version="1.0" encoding="utf-8"?>
 <w:document xmlns:w="http://schemas.openxmlformats.org/wordprocessingml/2006/main" xmlns:m="http://schemas.openxmlformats.org/officeDocument/2006/math" xmlns:r="http://schemas.openxmlformats.org/officeDocument/2006/relationships" xmlns:o="urn:schemas-microsoft-com:office:office" xmlns:v="urn:schemas-microsoft-com:vml" xmlns:w10="urn:schemas-microsoft-com:office:word" xmlns:a="http://schemas.openxmlformats.org/drawingml/2006/main" xmlns:pic="http://schemas.openxmlformats.org/drawingml/2006/picture" xmlns:wp="http://schemas.openxmlformats.org/drawingml/2006/wordprocessingDrawing">
   <w:body>
-    <w:bookmarkStart w:id="58" w:name="seip"/>
+    <w:bookmarkStart w:id="60" w:name="seip"/>
     <w:p>
       <w:pPr>
         <w:pStyle w:val="Heading1"/>
@@ -41,7 +41,7 @@
           <w:b/>
           <w:bCs/>
         </w:rPr>
-        <w:t xml:space="preserve">Whitepaper v0.3 · April 2026</w:t>
+        <w:t xml:space="preserve">Whitepaper v0.3 · May 2026</w:t>
       </w:r>
     </w:p>
     <w:p>
@@ -53,7 +53,7 @@
           <w:i/>
           <w:iCs/>
         </w:rPr>
-        <w:t xml:space="preserve">Publication candidate. This version aligns the protocol, documentation, and reference CLI around Git-native state, first-class data type risk, and pluggable notification adapters.</w:t>
+        <w:t xml:space="preserve">Publication candidate. This version aligns the protocol, documentation, reference CLI, runnable demos, generated multi-repo pilot assets, and pluggable notification adapters around Git-native state and first-class data type risk.</w:t>
       </w:r>
     </w:p>
     <w:p>
@@ -100,12 +100,20 @@
     </w:p>
     <w:p>
       <w:pPr>
+        <w:pStyle w:val="BodyText"/>
+      </w:pPr>
+      <w:r>
+        <w:t xml:space="preserve">The current reference package includes a quick lifecycle demo, an enterprise stress demo, and a generated multi-repo exhibit that creates a producer repository plus API, payments, warehouse, machine-learning, and analytics consumer repositories. These assets are intentionally executable rather than illustrative: they let evaluators inspect declaration files, schemas, validation scripts, GitHub Actions examples, consumer evidence, and audit history on disk.</w:t>
+      </w:r>
+    </w:p>
+    <w:p>
+      <w:pPr>
         <w:pStyle w:val="CaptionedFigure"/>
       </w:pPr>
       <w:r>
         <w:drawing>
           <wp:inline>
-            <wp:extent cx="5334000" cy="5334000"/>
+            <wp:extent cx="5334000" cy="1396918"/>
             <wp:effectExtent b="0" l="0" r="0" t="0"/>
             <wp:docPr descr="SEIP overview" title="" id="11" name="Picture"/>
             <a:graphic>
@@ -126,7 +134,7 @@
                   <pic:spPr bwMode="auto">
                     <a:xfrm>
                       <a:off x="0" y="0"/>
-                      <a:ext cx="5334000" cy="5334000"/>
+                      <a:ext cx="5334000" cy="1396918"/>
                     </a:xfrm>
                     <a:prstGeom prst="rect">
                       <a:avLst/>
@@ -162,7 +170,7 @@
           <w:i/>
           <w:iCs/>
         </w:rPr>
-        <w:t xml:space="preserve">Figure 0. SEIP keeps declaration state in Git while CI, review surfaces, and adapters consume the same artifact.</w:t>
+        <w:t xml:space="preserve">Figure 0. SEIP keeps declaration state in Git while CI, generated pilot repos, review surfaces, and adapters consume the same artifact.</w:t>
       </w:r>
     </w:p>
     <w:bookmarkEnd w:id="13"/>
@@ -583,7 +591,7 @@
       </w:r>
     </w:p>
     <w:bookmarkEnd w:id="21"/>
-    <w:bookmarkStart w:id="26" w:name="design-principles"/>
+    <w:bookmarkStart w:id="27" w:name="design-principles"/>
     <w:p>
       <w:pPr>
         <w:pStyle w:val="Heading2"/>
@@ -829,8 +837,26 @@
       </w:r>
     </w:p>
     <w:bookmarkEnd w:id="25"/>
+    <w:bookmarkStart w:id="26" w:name="X12b0afbee5c089089a84066e5d57aaa11843f44"/>
+    <w:p>
+      <w:pPr>
+        <w:pStyle w:val="Heading3"/>
+      </w:pPr>
+      <w:r>
+        <w:t xml:space="preserve">Pilot Assets Are Part Of The Product Surface</w:t>
+      </w:r>
+    </w:p>
+    <w:p>
+      <w:pPr>
+        <w:pStyle w:val="FirstParagraph"/>
+      </w:pPr>
+      <w:r>
+        <w:t xml:space="preserve">A protocol intended for real organizations needs more than a happy-path transcript. The reference package includes executable demos at three depths: a quick single-repo lifecycle, an enterprise stress demo with API, data, analytics, and machine-learning consumers, and a generated multi-repo exhibit that produces inspectable repositories with validation evidence. This makes SEIP tangible enough for platform teams, data teams, and agentic automation to evaluate without first building their own sample organization.</w:t>
+      </w:r>
+    </w:p>
     <w:bookmarkEnd w:id="26"/>
-    <w:bookmarkStart w:id="30" w:name="core-declaration-model"/>
+    <w:bookmarkEnd w:id="27"/>
+    <w:bookmarkStart w:id="31" w:name="core-declaration-model"/>
     <w:p>
       <w:pPr>
         <w:pStyle w:val="Heading2"/>
@@ -972,18 +998,18 @@
           <wp:inline>
             <wp:extent cx="5334000" cy="5334000"/>
             <wp:effectExtent b="0" l="0" r="0" t="0"/>
-            <wp:docPr descr="Canonical model" title="" id="28" name="Picture"/>
+            <wp:docPr descr="Canonical model" title="" id="29" name="Picture"/>
             <a:graphic>
               <a:graphicData uri="http://schemas.openxmlformats.org/drawingml/2006/picture">
                 <pic:pic>
                   <pic:nvPicPr>
-                    <pic:cNvPr descr="./diagrams/canonical-model.png" id="29" name="Picture"/>
+                    <pic:cNvPr descr="./diagrams/canonical-model.png" id="30" name="Picture"/>
                     <pic:cNvPicPr>
                       <a:picLocks noChangeArrowheads="1" noChangeAspect="1"/>
                     </pic:cNvPicPr>
                   </pic:nvPicPr>
                   <pic:blipFill>
-                    <a:blip r:embed="rId27"/>
+                    <a:blip r:embed="rId28"/>
                     <a:stretch>
                       <a:fillRect/>
                     </a:stretch>
@@ -1030,8 +1056,8 @@
         <w:t xml:space="preserve">Figure 2. Git stores the canonical declaration while downstream surfaces render or enforce it.</w:t>
       </w:r>
     </w:p>
-    <w:bookmarkEnd w:id="30"/>
-    <w:bookmarkStart w:id="37" w:name="notification-model"/>
+    <w:bookmarkEnd w:id="31"/>
+    <w:bookmarkStart w:id="38" w:name="notification-model"/>
     <w:p>
       <w:pPr>
         <w:pStyle w:val="Heading2"/>
@@ -1063,7 +1089,7 @@
         <w:t xml:space="preserve">a required protocol field. Instead, the reference CLI exposes notification adapters that render the canonical declaration into delivery-specific payloads.</w:t>
       </w:r>
     </w:p>
-    <w:bookmarkStart w:id="33" w:name="github-as-the-default-human-workflow"/>
+    <w:bookmarkStart w:id="34" w:name="github-as-the-default-human-workflow"/>
     <w:p>
       <w:pPr>
         <w:pStyle w:val="Heading3"/>
@@ -1171,7 +1197,7 @@
           <w:numId w:val="1006"/>
         </w:numPr>
       </w:pPr>
-      <w:hyperlink r:id="rId31">
+      <w:hyperlink r:id="rId32">
         <w:r>
           <w:rPr>
             <w:rStyle w:val="Hyperlink"/>
@@ -1188,7 +1214,7 @@
           <w:numId w:val="1006"/>
         </w:numPr>
       </w:pPr>
-      <w:hyperlink r:id="rId32">
+      <w:hyperlink r:id="rId33">
         <w:r>
           <w:rPr>
             <w:rStyle w:val="Hyperlink"/>
@@ -1197,8 +1223,8 @@
         </w:r>
       </w:hyperlink>
     </w:p>
-    <w:bookmarkEnd w:id="33"/>
-    <w:bookmarkStart w:id="36" w:name="slack-as-a-pluggable-channel-adapter"/>
+    <w:bookmarkEnd w:id="34"/>
+    <w:bookmarkStart w:id="37" w:name="slack-as-a-pluggable-channel-adapter"/>
     <w:p>
       <w:pPr>
         <w:pStyle w:val="Heading3"/>
@@ -1239,7 +1265,7 @@
           <w:numId w:val="1007"/>
         </w:numPr>
       </w:pPr>
-      <w:hyperlink r:id="rId34">
+      <w:hyperlink r:id="rId35">
         <w:r>
           <w:rPr>
             <w:rStyle w:val="Hyperlink"/>
@@ -1256,7 +1282,7 @@
           <w:numId w:val="1007"/>
         </w:numPr>
       </w:pPr>
-      <w:hyperlink r:id="rId35">
+      <w:hyperlink r:id="rId36">
         <w:r>
           <w:rPr>
             <w:rStyle w:val="Hyperlink"/>
@@ -1265,9 +1291,9 @@
         </w:r>
       </w:hyperlink>
     </w:p>
-    <w:bookmarkEnd w:id="36"/>
     <w:bookmarkEnd w:id="37"/>
-    <w:bookmarkStart w:id="41" w:name="declaration-lifecycle"/>
+    <w:bookmarkEnd w:id="38"/>
+    <w:bookmarkStart w:id="42" w:name="declaration-lifecycle"/>
     <w:p>
       <w:pPr>
         <w:pStyle w:val="Heading2"/>
@@ -1474,18 +1500,18 @@
           <wp:inline>
             <wp:extent cx="5334000" cy="5334000"/>
             <wp:effectExtent b="0" l="0" r="0" t="0"/>
-            <wp:docPr descr="Declaration lifecycle" title="" id="39" name="Picture"/>
+            <wp:docPr descr="Declaration lifecycle" title="" id="40" name="Picture"/>
             <a:graphic>
               <a:graphicData uri="http://schemas.openxmlformats.org/drawingml/2006/picture">
                 <pic:pic>
                   <pic:nvPicPr>
-                    <pic:cNvPr descr="./diagrams/lifecycle.png" id="40" name="Picture"/>
+                    <pic:cNvPr descr="./diagrams/lifecycle.png" id="41" name="Picture"/>
                     <pic:cNvPicPr>
                       <a:picLocks noChangeArrowheads="1" noChangeAspect="1"/>
                     </pic:cNvPicPr>
                   </pic:nvPicPr>
                   <pic:blipFill>
-                    <a:blip r:embed="rId38"/>
+                    <a:blip r:embed="rId39"/>
                     <a:stretch>
                       <a:fillRect/>
                     </a:stretch>
@@ -1532,8 +1558,8 @@
         <w:t xml:space="preserve">Figure 3. Consumer responses move declarations through review, enforcement, and closure states.</w:t>
       </w:r>
     </w:p>
-    <w:bookmarkEnd w:id="41"/>
-    <w:bookmarkStart w:id="48" w:name="reference-cli-workflow"/>
+    <w:bookmarkEnd w:id="42"/>
+    <w:bookmarkStart w:id="50" w:name="reference-cli-workflow"/>
     <w:p>
       <w:pPr>
         <w:pStyle w:val="Heading2"/>
@@ -1550,7 +1576,7 @@
         <w:t xml:space="preserve">The following example uses commands supported by the current reference CLI.</w:t>
       </w:r>
     </w:p>
-    <w:bookmarkStart w:id="42" w:name="step-1-detect-a-lossy-type-change"/>
+    <w:bookmarkStart w:id="43" w:name="step-1-detect-a-lossy-type-change"/>
     <w:p>
       <w:pPr>
         <w:pStyle w:val="Heading3"/>
@@ -1655,8 +1681,8 @@
         <w:t xml:space="preserve">The diff reports a lossy retype and marks the change as breaking.</w:t>
       </w:r>
     </w:p>
-    <w:bookmarkEnd w:id="42"/>
-    <w:bookmarkStart w:id="43" w:name="step-2-create-a-declaration"/>
+    <w:bookmarkEnd w:id="43"/>
+    <w:bookmarkStart w:id="44" w:name="step-2-create-a-declaration"/>
     <w:p>
       <w:pPr>
         <w:pStyle w:val="Heading3"/>
@@ -1957,8 +1983,8 @@
         <w:t xml:space="preserve">.</w:t>
       </w:r>
     </w:p>
-    <w:bookmarkEnd w:id="43"/>
-    <w:bookmarkStart w:id="44" w:name="step-3-propose-the-change"/>
+    <w:bookmarkEnd w:id="44"/>
+    <w:bookmarkStart w:id="45" w:name="step-3-propose-the-change"/>
     <w:p>
       <w:pPr>
         <w:pStyle w:val="Heading3"/>
@@ -2004,8 +2030,8 @@
         <w:t xml:space="preserve">The declaration is now ready for consumer review.</w:t>
       </w:r>
     </w:p>
-    <w:bookmarkEnd w:id="44"/>
-    <w:bookmarkStart w:id="45" w:name="step-4-surface-the-declaration"/>
+    <w:bookmarkEnd w:id="45"/>
+    <w:bookmarkStart w:id="46" w:name="step-4-surface-the-declaration"/>
     <w:p>
       <w:pPr>
         <w:pStyle w:val="Heading3"/>
@@ -2243,8 +2269,8 @@
         <w:t xml:space="preserve">Both adapters are rendering the same declaration state.</w:t>
       </w:r>
     </w:p>
-    <w:bookmarkEnd w:id="45"/>
-    <w:bookmarkStart w:id="46" w:name="step-5-consumers-validate-and-respond"/>
+    <w:bookmarkEnd w:id="46"/>
+    <w:bookmarkStart w:id="47" w:name="step-5-consumers-validate-and-respond"/>
     <w:p>
       <w:pPr>
         <w:pStyle w:val="Heading3"/>
@@ -2677,8 +2703,8 @@
         <w:t xml:space="preserve">.</w:t>
       </w:r>
     </w:p>
-    <w:bookmarkEnd w:id="46"/>
-    <w:bookmarkStart w:id="47" w:name="step-6-resolve-or-withdraw"/>
+    <w:bookmarkEnd w:id="47"/>
+    <w:bookmarkStart w:id="48" w:name="step-6-resolve-or-withdraw"/>
     <w:p>
       <w:pPr>
         <w:pStyle w:val="Heading3"/>
@@ -2792,9 +2818,196 @@
         <w:t xml:space="preserve">The audit trail remains in Git.</w:t>
       </w:r>
     </w:p>
-    <w:bookmarkEnd w:id="47"/>
     <w:bookmarkEnd w:id="48"/>
-    <w:bookmarkStart w:id="52" w:name="ci-first-adoption-path"/>
+    <w:bookmarkStart w:id="49" w:name="step-7-exercise-the-reference-pilots"/>
+    <w:p>
+      <w:pPr>
+        <w:pStyle w:val="Heading3"/>
+      </w:pPr>
+      <w:r>
+        <w:t xml:space="preserve">Step 7: Exercise The Reference Pilots</w:t>
+      </w:r>
+    </w:p>
+    <w:p>
+      <w:pPr>
+        <w:pStyle w:val="FirstParagraph"/>
+      </w:pPr>
+      <w:r>
+        <w:t xml:space="preserve">The reference package includes progressively richer demos:</w:t>
+      </w:r>
+    </w:p>
+    <w:p>
+      <w:pPr>
+        <w:pStyle w:val="SourceCode"/>
+      </w:pPr>
+      <w:r>
+        <w:rPr>
+          <w:rStyle w:val="ExtensionTok"/>
+        </w:rPr>
+        <w:t xml:space="preserve">npm</w:t>
+      </w:r>
+      <w:r>
+        <w:rPr>
+          <w:rStyle w:val="NormalTok"/>
+        </w:rPr>
+        <w:t xml:space="preserve"> run demo</w:t>
+      </w:r>
+      <w:r>
+        <w:br/>
+      </w:r>
+      <w:r>
+        <w:rPr>
+          <w:rStyle w:val="ExtensionTok"/>
+        </w:rPr>
+        <w:t xml:space="preserve">npm</w:t>
+      </w:r>
+      <w:r>
+        <w:rPr>
+          <w:rStyle w:val="NormalTok"/>
+        </w:rPr>
+        <w:t xml:space="preserve"> run demo:enterprise</w:t>
+      </w:r>
+      <w:r>
+        <w:br/>
+      </w:r>
+      <w:r>
+        <w:rPr>
+          <w:rStyle w:val="ExtensionTok"/>
+        </w:rPr>
+        <w:t xml:space="preserve">npm</w:t>
+      </w:r>
+      <w:r>
+        <w:rPr>
+          <w:rStyle w:val="NormalTok"/>
+        </w:rPr>
+        <w:t xml:space="preserve"> run demo:repos</w:t>
+      </w:r>
+    </w:p>
+    <w:p>
+      <w:pPr>
+        <w:pStyle w:val="FirstParagraph"/>
+      </w:pPr>
+      <w:r>
+        <w:rPr>
+          <w:rStyle w:val="VerbatimChar"/>
+        </w:rPr>
+        <w:t xml:space="preserve">npm run demo</w:t>
+      </w:r>
+      <w:r>
+        <w:t xml:space="preserve"> </w:t>
+      </w:r>
+      <w:r>
+        <w:t xml:space="preserve">demonstrates the compact lifecycle.</w:t>
+      </w:r>
+      <w:r>
+        <w:t xml:space="preserve"> </w:t>
+      </w:r>
+      <w:r>
+        <w:rPr>
+          <w:rStyle w:val="VerbatimChar"/>
+        </w:rPr>
+        <w:t xml:space="preserve">npm run demo:enterprise</w:t>
+      </w:r>
+      <w:r>
+        <w:t xml:space="preserve"> </w:t>
+      </w:r>
+      <w:r>
+        <w:t xml:space="preserve">stresses one breaking event rollout across API, data, analytics, and ML consumers.</w:t>
+      </w:r>
+      <w:r>
+        <w:t xml:space="preserve"> </w:t>
+      </w:r>
+      <w:r>
+        <w:rPr>
+          <w:rStyle w:val="VerbatimChar"/>
+        </w:rPr>
+        <w:t xml:space="preserve">npm run demo:repos</w:t>
+      </w:r>
+      <w:r>
+        <w:t xml:space="preserve"> </w:t>
+      </w:r>
+      <w:r>
+        <w:t xml:space="preserve">creates an inspectable local organization with</w:t>
+      </w:r>
+      <w:r>
+        <w:t xml:space="preserve"> </w:t>
+      </w:r>
+      <w:r>
+        <w:rPr>
+          <w:rStyle w:val="VerbatimChar"/>
+        </w:rPr>
+        <w:t xml:space="preserve">commerce-events</w:t>
+      </w:r>
+      <w:r>
+        <w:t xml:space="preserve">,</w:t>
+      </w:r>
+      <w:r>
+        <w:t xml:space="preserve"> </w:t>
+      </w:r>
+      <w:r>
+        <w:rPr>
+          <w:rStyle w:val="VerbatimChar"/>
+        </w:rPr>
+        <w:t xml:space="preserve">partner-api</w:t>
+      </w:r>
+      <w:r>
+        <w:t xml:space="preserve">,</w:t>
+      </w:r>
+      <w:r>
+        <w:t xml:space="preserve"> </w:t>
+      </w:r>
+      <w:r>
+        <w:rPr>
+          <w:rStyle w:val="VerbatimChar"/>
+        </w:rPr>
+        <w:t xml:space="preserve">payments-ledger</w:t>
+      </w:r>
+      <w:r>
+        <w:t xml:space="preserve">,</w:t>
+      </w:r>
+      <w:r>
+        <w:t xml:space="preserve"> </w:t>
+      </w:r>
+      <w:r>
+        <w:rPr>
+          <w:rStyle w:val="VerbatimChar"/>
+        </w:rPr>
+        <w:t xml:space="preserve">warehouse-dbt</w:t>
+      </w:r>
+      <w:r>
+        <w:t xml:space="preserve">,</w:t>
+      </w:r>
+      <w:r>
+        <w:t xml:space="preserve"> </w:t>
+      </w:r>
+      <w:r>
+        <w:rPr>
+          <w:rStyle w:val="VerbatimChar"/>
+        </w:rPr>
+        <w:t xml:space="preserve">fraud-models</w:t>
+      </w:r>
+      <w:r>
+        <w:t xml:space="preserve">, and</w:t>
+      </w:r>
+      <w:r>
+        <w:t xml:space="preserve"> </w:t>
+      </w:r>
+      <w:r>
+        <w:rPr>
+          <w:rStyle w:val="VerbatimChar"/>
+        </w:rPr>
+        <w:t xml:space="preserve">mobile-analytics</w:t>
+      </w:r>
+      <w:r>
+        <w:t xml:space="preserve"> </w:t>
+      </w:r>
+      <w:r>
+        <w:t xml:space="preserve">repositories. The generated repos include schemas, validation commands, CI examples, consumer responses, and final SEIP declaration state.</w:t>
+      </w:r>
+    </w:p>
+    <w:bookmarkEnd w:id="49"/>
+    <w:bookmarkEnd w:id="50"/>
+    <w:bookmarkStart w:id="54" w:name="ci-first-adoption-path"/>
     <w:p>
       <w:pPr>
         <w:pStyle w:val="Heading2"/>
@@ -2933,7 +3146,7 @@
         </w:numPr>
       </w:pPr>
       <w:r>
-        <w:t xml:space="preserve">Create declarations for breaking changes.</w:t>
+        <w:t xml:space="preserve">Run the quick, enterprise, and generated repo demos to establish the operating model.</w:t>
       </w:r>
     </w:p>
     <w:p>
@@ -2945,7 +3158,7 @@
         </w:numPr>
       </w:pPr>
       <w:r>
-        <w:t xml:space="preserve">Request reviews from affected consumers.</w:t>
+        <w:t xml:space="preserve">Create declarations for breaking changes in one pilot repository.</w:t>
       </w:r>
     </w:p>
     <w:p>
@@ -2957,6 +3170,18 @@
         </w:numPr>
       </w:pPr>
       <w:r>
+        <w:t xml:space="preserve">Request reviews from affected consumers and capture validation evidence.</w:t>
+      </w:r>
+    </w:p>
+    <w:p>
+      <w:pPr>
+        <w:pStyle w:val="Compact"/>
+        <w:numPr>
+          <w:ilvl w:val="0"/>
+          <w:numId w:val="1010"/>
+        </w:numPr>
+      </w:pPr>
+      <w:r>
         <w:t xml:space="preserve">Emit GitHub or Slack notification payloads if useful.</w:t>
       </w:r>
     </w:p>
@@ -2970,6 +3195,18 @@
       </w:pPr>
       <w:r>
         <w:t xml:space="preserve">Tighten policy to require minimum statuses or required consumer acknowledgements.</w:t>
+      </w:r>
+    </w:p>
+    <w:p>
+      <w:pPr>
+        <w:pStyle w:val="Compact"/>
+        <w:numPr>
+          <w:ilvl w:val="0"/>
+          <w:numId w:val="1010"/>
+        </w:numPr>
+      </w:pPr>
+      <w:r>
+        <w:t xml:space="preserve">Expand to more producers only after the pilot shows response quality, ownership, and audit history are working.</w:t>
       </w:r>
     </w:p>
     <w:p>
@@ -2979,20 +3216,20 @@
       <w:r>
         <w:drawing>
           <wp:inline>
-            <wp:extent cx="5334000" cy="5334000"/>
+            <wp:extent cx="5334000" cy="1197096"/>
             <wp:effectExtent b="0" l="0" r="0" t="0"/>
-            <wp:docPr descr="Adoption wedge" title="" id="50" name="Picture"/>
+            <wp:docPr descr="Adoption wedge" title="" id="52" name="Picture"/>
             <a:graphic>
               <a:graphicData uri="http://schemas.openxmlformats.org/drawingml/2006/picture">
                 <pic:pic>
                   <pic:nvPicPr>
-                    <pic:cNvPr descr="./diagrams/adoption-wedge.png" id="51" name="Picture"/>
+                    <pic:cNvPr descr="./diagrams/adoption-wedge.png" id="53" name="Picture"/>
                     <pic:cNvPicPr>
                       <a:picLocks noChangeArrowheads="1" noChangeAspect="1"/>
                     </pic:cNvPicPr>
                   </pic:nvPicPr>
                   <pic:blipFill>
-                    <a:blip r:embed="rId49"/>
+                    <a:blip r:embed="rId51"/>
                     <a:stretch>
                       <a:fillRect/>
                     </a:stretch>
@@ -3000,7 +3237,7 @@
                   <pic:spPr bwMode="auto">
                     <a:xfrm>
                       <a:off x="0" y="0"/>
-                      <a:ext cx="5334000" cy="5334000"/>
+                      <a:ext cx="5334000" cy="1197096"/>
                     </a:xfrm>
                     <a:prstGeom prst="rect">
                       <a:avLst/>
@@ -3036,11 +3273,11 @@
           <w:i/>
           <w:iCs/>
         </w:rPr>
-        <w:t xml:space="preserve">Figure 4. Teams can start with a CI gate and add richer review or notification surfaces later.</w:t>
-      </w:r>
-    </w:p>
-    <w:bookmarkEnd w:id="52"/>
-    <w:bookmarkStart w:id="53" w:name="automation-interface"/>
+        <w:t xml:space="preserve">Figure 4. Teams can start with a CI gate, prove the operating model with generated repos, and add richer review or notification surfaces later.</w:t>
+      </w:r>
+    </w:p>
+    <w:bookmarkEnd w:id="54"/>
+    <w:bookmarkStart w:id="55" w:name="automation-interface"/>
     <w:p>
       <w:pPr>
         <w:pStyle w:val="Heading2"/>
@@ -3217,8 +3454,16 @@
         <w:t xml:space="preserve">This lets CI jobs, internal portals, and agents consume the same state humans review in Git.</w:t>
       </w:r>
     </w:p>
-    <w:bookmarkEnd w:id="53"/>
-    <w:bookmarkStart w:id="54" w:name="migration-scope"/>
+    <w:p>
+      <w:pPr>
+        <w:pStyle w:val="BodyText"/>
+      </w:pPr>
+      <w:r>
+        <w:t xml:space="preserve">Agentic actors can use these JSON surfaces to detect undeclared breaking changes, prepare declaration drafts, run consumer validation commands, summarize objections, and post review evidence. SEIP should not give agents a blank-check approval role. The useful boundary is evidence production and state transition assistance: agents can propose, validate, summarize, and record, while organization policy decides which transitions require human review.</w:t>
+      </w:r>
+    </w:p>
+    <w:bookmarkEnd w:id="55"/>
+    <w:bookmarkStart w:id="56" w:name="migration-scope"/>
     <w:p>
       <w:pPr>
         <w:pStyle w:val="Heading2"/>
@@ -3299,8 +3544,8 @@
         <w:t xml:space="preserve">Consumers still own their local migration work. One consumer may need a simple field rename. Another may need a backfill, reindex, parser change, or model retraining. SEIP gives those consumers a durable place to respond and gives CI a durable state to enforce. The consumer validation hook is deliberately command-based so teams can connect their existing parser tests, query checks, dbt builds, contract tests, or model rehearsals instead of waiting for SEIP to understand every downstream runtime.</w:t>
       </w:r>
     </w:p>
-    <w:bookmarkEnd w:id="54"/>
-    <w:bookmarkStart w:id="55" w:name="current-limitations"/>
+    <w:bookmarkEnd w:id="56"/>
+    <w:bookmarkStart w:id="57" w:name="current-limitations"/>
     <w:p>
       <w:pPr>
         <w:pStyle w:val="Heading2"/>
@@ -3433,6 +3678,18 @@
         </w:numPr>
       </w:pPr>
       <w:r>
+        <w:t xml:space="preserve">Generated demo repositories are local pilot assets, not a hosted multi-repo control plane. They prove workflow shape and integration points, but production adoption still needs organization-specific repository permissions, CODEOWNERS, branch protection, and CI policy.</w:t>
+      </w:r>
+    </w:p>
+    <w:p>
+      <w:pPr>
+        <w:pStyle w:val="Compact"/>
+        <w:numPr>
+          <w:ilvl w:val="0"/>
+          <w:numId w:val="1012"/>
+        </w:numPr>
+      </w:pPr>
+      <w:r>
         <w:t xml:space="preserve">Review deadline behavior is policy-driven; SEIP does not auto-accept or auto-reject missed responses.</w:t>
       </w:r>
     </w:p>
@@ -3444,8 +3701,8 @@
         <w:t xml:space="preserve">These limits are appropriate for a protocol that aims to be adopted incrementally rather than introduced as a heavyweight platform.</w:t>
       </w:r>
     </w:p>
-    <w:bookmarkEnd w:id="55"/>
-    <w:bookmarkStart w:id="56" w:name="conclusion"/>
+    <w:bookmarkEnd w:id="57"/>
+    <w:bookmarkStart w:id="58" w:name="conclusion"/>
     <w:p>
       <w:pPr>
         <w:pStyle w:val="Heading2"/>
@@ -3490,8 +3747,16 @@
         <w:t xml:space="preserve">It is Git as canonical state, CI as enforcement, GitHub as the natural review and notification surface for many teams, Slack as a useful pluggable channel, and declarations as the durable contract between producers and consumers.</w:t>
       </w:r>
     </w:p>
-    <w:bookmarkEnd w:id="56"/>
-    <w:bookmarkStart w:id="57" w:name="appendix-diagram-sources"/>
+    <w:p>
+      <w:pPr>
+        <w:pStyle w:val="BodyText"/>
+      </w:pPr>
+      <w:r>
+        <w:t xml:space="preserve">The next proof point is a real pilot integration: one producer, two or more actual downstream consumers, one enforced CI gate, and a recorded response cycle that can survive normal engineering pressure. The reference package now includes a pilot integration guide for that transition from generated exhibits to real repositories.</w:t>
+      </w:r>
+    </w:p>
+    <w:bookmarkEnd w:id="58"/>
+    <w:bookmarkStart w:id="59" w:name="appendix-diagram-sources"/>
     <w:p>
       <w:pPr>
         <w:pStyle w:val="Heading2"/>
@@ -3590,8 +3855,8 @@
         <w:t xml:space="preserve">docs/diagrams/adoption-wedge.d2</w:t>
       </w:r>
     </w:p>
-    <w:bookmarkEnd w:id="57"/>
-    <w:bookmarkEnd w:id="58"/>
+    <w:bookmarkEnd w:id="59"/>
+    <w:bookmarkEnd w:id="60"/>
     <w:sectPr>
       <w:pgSz w:w="12240" w:h="15840"/>
       <w:pgMar w:top="1440" w:right="1440" w:bottom="1440" w:left="1440" w:header="720" w:footer="720" w:gutter="0"/>

</xml_diff>